<commit_message>
Preserve agreement typography and use uppercase supplier headings
</commit_message>
<xml_diff>
--- a/company_templates/AGENCY AGREEMENT.docx
+++ b/company_templates/AGENCY AGREEMENT.docx
@@ -458,27 +458,27 @@
       </w:r>
       <w:proofErr w:type="gramStart"/>
       <w:r>
-        <w:t xml:space="preserve">{{ </w:t>
+        <w:t xml:space="preserve">{{ supplier_name | upper }}</w:t>
       </w:r>
       <w:proofErr w:type="spellStart"/>
       <w:r>
-        <w:t>supplier</w:t>
+        <w:t xml:space="preserve"/>
       </w:r>
       <w:proofErr w:type="gramEnd"/>
       <w:r>
-        <w:t>_</w:t>
+        <w:t xml:space="preserve"/>
       </w:r>
       <w:proofErr w:type="gramStart"/>
       <w:r>
-        <w:t>name</w:t>
+        <w:t xml:space="preserve"/>
       </w:r>
       <w:proofErr w:type="spellEnd"/>
       <w:r>
-        <w:t xml:space="preserve"> }</w:t>
+        <w:t xml:space="preserve"/>
       </w:r>
       <w:proofErr w:type="gramEnd"/>
       <w:r>
-        <w:t>}</w:t>
+        <w:t xml:space="preserve"/>
       </w:r>
       <w:r>
         <w:t xml:space="preserve">, the foreign manufacturer or exporter submitting a bid to SPMC under Tender </w:t>
@@ -2114,7 +2114,7 @@
                 <w:rFonts w:ascii="Calibri" w:eastAsia="Calibri" w:hAnsi="Calibri" w:cs="Calibri"/>
                 <w:b/>
               </w:rPr>
-              <w:t xml:space="preserve">{{ </w:t>
+              <w:t xml:space="preserve">{{ supplier_name | upper }}</w:t>
             </w:r>
             <w:proofErr w:type="spellStart"/>
             <w:r>
@@ -2122,7 +2122,7 @@
                 <w:rFonts w:ascii="Calibri" w:eastAsia="Calibri" w:hAnsi="Calibri" w:cs="Calibri"/>
                 <w:b/>
               </w:rPr>
-              <w:t>supplier</w:t>
+              <w:t xml:space="preserve"/>
             </w:r>
             <w:proofErr w:type="gramEnd"/>
             <w:r>
@@ -2130,7 +2130,7 @@
                 <w:rFonts w:ascii="Calibri" w:eastAsia="Calibri" w:hAnsi="Calibri" w:cs="Calibri"/>
                 <w:b/>
               </w:rPr>
-              <w:t>_</w:t>
+              <w:t xml:space="preserve"/>
             </w:r>
             <w:proofErr w:type="gramStart"/>
             <w:r>
@@ -2138,7 +2138,7 @@
                 <w:rFonts w:ascii="Calibri" w:eastAsia="Calibri" w:hAnsi="Calibri" w:cs="Calibri"/>
                 <w:b/>
               </w:rPr>
-              <w:t>name</w:t>
+              <w:t xml:space="preserve"/>
             </w:r>
             <w:proofErr w:type="spellEnd"/>
             <w:r>
@@ -2146,7 +2146,7 @@
                 <w:rFonts w:ascii="Calibri" w:eastAsia="Calibri" w:hAnsi="Calibri" w:cs="Calibri"/>
                 <w:b/>
               </w:rPr>
-              <w:t xml:space="preserve"> }</w:t>
+              <w:t xml:space="preserve"/>
             </w:r>
             <w:proofErr w:type="gramEnd"/>
             <w:r>
@@ -2154,7 +2154,7 @@
                 <w:rFonts w:ascii="Calibri" w:eastAsia="Calibri" w:hAnsi="Calibri" w:cs="Calibri"/>
                 <w:b/>
               </w:rPr>
-              <w:t>}</w:t>
+              <w:t xml:space="preserve"/>
             </w:r>
           </w:p>
           <w:p>

</xml_diff>